<commit_message>
Update repo URL after GitHub rename to Anomalyy
</commit_message>
<xml_diff>
--- a/final_report.docx
+++ b/final_report.docx
@@ -11,7 +11,7 @@
         <w:t xml:space="preserve">Final Report</w:t>
       </w:r>
     </w:p>
-    <w:bookmarkStart w:id="9" w:name="title"/>
+    <w:bookmarkStart w:id="10" w:name="title"/>
     <w:p>
       <w:pPr>
         <w:pStyle w:val="Heading2"/>
@@ -28,8 +28,27 @@
         <w:t xml:space="preserve">Anomalyy: Multi-Method Detection and Semantic Classification of Stock-Market Anomalies Using FOMC Events, GDELT News Sentiment, and Cross-Stock Contagion</w:t>
       </w:r>
     </w:p>
-    <w:bookmarkEnd w:id="9"/>
-    <w:bookmarkStart w:id="10" w:name="team-members"/>
+    <w:p>
+      <w:pPr>
+        <w:pStyle w:val="BodyText"/>
+      </w:pPr>
+      <w:hyperlink r:id="rId9">
+        <w:r>
+          <w:rPr>
+            <w:rStyle w:val="Hyperlink"/>
+          </w:rPr>
+          <w:t xml:space="preserve">Anomalyy</w:t>
+        </w:r>
+      </w:hyperlink>
+      <w:r>
+        <w:t xml:space="preserve"> </w:t>
+      </w:r>
+      <w:r>
+        <w:t xml:space="preserve">| Video link</w:t>
+      </w:r>
+    </w:p>
+    <w:bookmarkEnd w:id="10"/>
+    <w:bookmarkStart w:id="11" w:name="team-members"/>
     <w:p>
       <w:pPr>
         <w:pStyle w:val="Heading2"/>
@@ -48,40 +67,6 @@
       </w:pPr>
       <w:r>
         <w:t xml:space="preserve">Purabh Singh</w:t>
-      </w:r>
-    </w:p>
-    <w:bookmarkEnd w:id="10"/>
-    <w:bookmarkStart w:id="11" w:name="submission-links"/>
-    <w:p>
-      <w:pPr>
-        <w:pStyle w:val="Heading2"/>
-      </w:pPr>
-      <w:r>
-        <w:t xml:space="preserve">Submission Links</w:t>
-      </w:r>
-    </w:p>
-    <w:p>
-      <w:pPr>
-        <w:pStyle w:val="Compact"/>
-        <w:numPr>
-          <w:ilvl w:val="0"/>
-          <w:numId w:val="1002"/>
-        </w:numPr>
-      </w:pPr>
-      <w:r>
-        <w:t xml:space="preserve">GitHub Repository: https://github.com/Purabhh/Anomalyy</w:t>
-      </w:r>
-    </w:p>
-    <w:p>
-      <w:pPr>
-        <w:pStyle w:val="Compact"/>
-        <w:numPr>
-          <w:ilvl w:val="0"/>
-          <w:numId w:val="1002"/>
-        </w:numPr>
-      </w:pPr>
-      <w:r>
-        <w:t xml:space="preserve">Demo Video: [TBA]</w:t>
       </w:r>
     </w:p>
     <w:bookmarkEnd w:id="11"/>
@@ -4387,7 +4372,7 @@
         <w:pStyle w:val="Compact"/>
         <w:numPr>
           <w:ilvl w:val="0"/>
-          <w:numId w:val="1003"/>
+          <w:numId w:val="1002"/>
         </w:numPr>
       </w:pPr>
       <w:r>
@@ -4445,7 +4430,7 @@
         <w:pStyle w:val="Compact"/>
         <w:numPr>
           <w:ilvl w:val="0"/>
-          <w:numId w:val="1003"/>
+          <w:numId w:val="1002"/>
         </w:numPr>
       </w:pPr>
       <w:r>
@@ -4488,7 +4473,7 @@
         <w:pStyle w:val="Compact"/>
         <w:numPr>
           <w:ilvl w:val="0"/>
-          <w:numId w:val="1003"/>
+          <w:numId w:val="1002"/>
         </w:numPr>
       </w:pPr>
       <w:r>
@@ -4516,7 +4501,7 @@
         <w:pStyle w:val="Compact"/>
         <w:numPr>
           <w:ilvl w:val="0"/>
-          <w:numId w:val="1003"/>
+          <w:numId w:val="1002"/>
         </w:numPr>
       </w:pPr>
       <w:r>
@@ -4538,7 +4523,7 @@
         <w:pStyle w:val="Compact"/>
         <w:numPr>
           <w:ilvl w:val="0"/>
-          <w:numId w:val="1003"/>
+          <w:numId w:val="1002"/>
         </w:numPr>
       </w:pPr>
       <w:r>
@@ -4566,7 +4551,7 @@
         <w:pStyle w:val="Compact"/>
         <w:numPr>
           <w:ilvl w:val="0"/>
-          <w:numId w:val="1003"/>
+          <w:numId w:val="1002"/>
         </w:numPr>
       </w:pPr>
       <w:r>
@@ -4977,9 +4962,6 @@
     <w:abstractNumId w:val="991"/>
   </w:num>
   <w:num w:numId="1002">
-    <w:abstractNumId w:val="991"/>
-  </w:num>
-  <w:num w:numId="1003">
     <w:abstractNumId w:val="991"/>
   </w:num>
 </w:numbering>

</xml_diff>

<commit_message>
Add demo video link
</commit_message>
<xml_diff>
--- a/final_report.docx
+++ b/final_report.docx
@@ -2,7 +2,7 @@
 <file path=word/document.xml><?xml version="1.0" encoding="utf-8"?>
 <w:document xmlns:w="http://schemas.openxmlformats.org/wordprocessingml/2006/main" xmlns:m="http://schemas.openxmlformats.org/officeDocument/2006/math" xmlns:r="http://schemas.openxmlformats.org/officeDocument/2006/relationships" xmlns:o="urn:schemas-microsoft-com:office:office" xmlns:v="urn:schemas-microsoft-com:vml" xmlns:w10="urn:schemas-microsoft-com:office:word" xmlns:a="http://schemas.openxmlformats.org/drawingml/2006/main" xmlns:pic="http://schemas.openxmlformats.org/drawingml/2006/picture" xmlns:wp="http://schemas.openxmlformats.org/drawingml/2006/wordprocessingDrawing">
   <w:body>
-    <w:bookmarkStart w:id="25" w:name="final-report"/>
+    <w:bookmarkStart w:id="26" w:name="final-report"/>
     <w:p>
       <w:pPr>
         <w:pStyle w:val="Heading1"/>
@@ -11,7 +11,7 @@
         <w:t xml:space="preserve">Final Report</w:t>
       </w:r>
     </w:p>
-    <w:bookmarkStart w:id="10" w:name="title"/>
+    <w:bookmarkStart w:id="11" w:name="title"/>
     <w:p>
       <w:pPr>
         <w:pStyle w:val="Heading2"/>
@@ -44,11 +44,22 @@
         <w:t xml:space="preserve"> </w:t>
       </w:r>
       <w:r>
-        <w:t xml:space="preserve">| Video link</w:t>
-      </w:r>
-    </w:p>
-    <w:bookmarkEnd w:id="10"/>
-    <w:bookmarkStart w:id="11" w:name="team-members"/>
+        <w:t xml:space="preserve">|</w:t>
+      </w:r>
+      <w:r>
+        <w:t xml:space="preserve"> </w:t>
+      </w:r>
+      <w:hyperlink r:id="rId10">
+        <w:r>
+          <w:rPr>
+            <w:rStyle w:val="Hyperlink"/>
+          </w:rPr>
+          <w:t xml:space="preserve">Video</w:t>
+        </w:r>
+      </w:hyperlink>
+    </w:p>
+    <w:bookmarkEnd w:id="11"/>
+    <w:bookmarkStart w:id="12" w:name="team-members"/>
     <w:p>
       <w:pPr>
         <w:pStyle w:val="Heading2"/>
@@ -69,8 +80,8 @@
         <w:t xml:space="preserve">Purabh Singh</w:t>
       </w:r>
     </w:p>
-    <w:bookmarkEnd w:id="11"/>
-    <w:bookmarkStart w:id="12" w:name="problem-definition-and-background"/>
+    <w:bookmarkEnd w:id="12"/>
+    <w:bookmarkStart w:id="13" w:name="problem-definition-and-background"/>
     <w:p>
       <w:pPr>
         <w:pStyle w:val="Heading2"/>
@@ -130,8 +141,8 @@
         <w:t xml:space="preserve">and news sentiment from GDELT 2.0 GKG by way of Google BigQuery), and machine learning (using unsupervised methods such as Z-score thresholding, Isolation Forest, and Local Outlier Factor). Stock market data is especially suitable for use in data management since it is voluminous, time-stamped, multi-source, and reusable for different purposes.</w:t>
       </w:r>
     </w:p>
-    <w:bookmarkEnd w:id="12"/>
-    <w:bookmarkStart w:id="13" w:name="data-description"/>
+    <w:bookmarkEnd w:id="13"/>
+    <w:bookmarkStart w:id="14" w:name="data-description"/>
     <w:p>
       <w:pPr>
         <w:pStyle w:val="Heading2"/>
@@ -583,8 +594,8 @@
         <w:t xml:space="preserve">Analysis will cover the period starting on 2015-01-01 until 2024-12-31 (ten years). Upon download and clean-up, the resulting dataset consists of 2,514 days per ticker (totaling 12,570 days worth of price records), about 12,500 aggregated daily news rows sourced from GDELT GKG (slightly less than 5 x 2,500 as GDELT 2.0 commences from February 18, 2015), the 78 days of FOMC meeting announcements, and 1,573 high-confidence anomalies (agreement ≥ 2). Re-runs yield consistent statistics after populating the cache in SQLite. Yahoo Finance price records contain the standard OHLCV entries and an adj_close field that adjusts prices for splits and dividends; GDELT daily entries have a UTC timestamp field, the four components of V2 tone (compound, positive, negative, and neutral), along with article_count. Post-feature-engineering, price data will be expanded to include 40+ additional columns in return, moving average, volatility, momentum, volume, statistic, and pattern families (see Section 6 for the complete list).</w:t>
       </w:r>
     </w:p>
-    <w:bookmarkEnd w:id="13"/>
-    <w:bookmarkStart w:id="15" w:name="database-design"/>
+    <w:bookmarkEnd w:id="14"/>
+    <w:bookmarkStart w:id="16" w:name="database-design"/>
     <w:p>
       <w:pPr>
         <w:pStyle w:val="Heading2"/>
@@ -982,7 +993,7 @@
         <w:t xml:space="preserve">row counts match the source DataFrame lengths to guard against silent insertion failures.</w:t>
       </w:r>
     </w:p>
-    <w:bookmarkStart w:id="14" w:name="sql-analysis"/>
+    <w:bookmarkStart w:id="15" w:name="sql-analysis"/>
     <w:p>
       <w:pPr>
         <w:pStyle w:val="Heading3"/>
@@ -1122,9 +1133,9 @@
         <w:t xml:space="preserve">. Together these queries demonstrate basic GROUP BY aggregation, correlated subqueries, multi-table joins, date functions, and self-joins.</w:t>
       </w:r>
     </w:p>
-    <w:bookmarkEnd w:id="14"/>
     <w:bookmarkEnd w:id="15"/>
-    <w:bookmarkStart w:id="16" w:name="data-cleaning-and-preparation"/>
+    <w:bookmarkEnd w:id="16"/>
+    <w:bookmarkStart w:id="17" w:name="data-cleaning-and-preparation"/>
     <w:p>
       <w:pPr>
         <w:pStyle w:val="Heading2"/>
@@ -1495,8 +1506,8 @@
         <w:t xml:space="preserve">s if not normalized at ingestion, and the database unique constraints would block re-runs entirely if the cleaning steps did not idempotently overwrite existing rows.</w:t>
       </w:r>
     </w:p>
-    <w:bookmarkEnd w:id="16"/>
-    <w:bookmarkStart w:id="17" w:name="exploratory-analysis-and-visualization"/>
+    <w:bookmarkEnd w:id="17"/>
+    <w:bookmarkStart w:id="18" w:name="exploratory-analysis-and-visualization"/>
     <w:p>
       <w:pPr>
         <w:pStyle w:val="Heading2"/>
@@ -1612,8 +1623,8 @@
         <w:t xml:space="preserve">distribution skews toward 2 (the minimum threshold) with a small but meaningful tail at 3 (full-consensus anomalies, the highest-confidence subset).</w:t>
       </w:r>
     </w:p>
-    <w:bookmarkEnd w:id="17"/>
-    <w:bookmarkStart w:id="18" w:name="feature-engineering-and-machine-learning"/>
+    <w:bookmarkEnd w:id="18"/>
+    <w:bookmarkStart w:id="19" w:name="feature-engineering-and-machine-learning"/>
     <w:p>
       <w:pPr>
         <w:pStyle w:val="Heading2"/>
@@ -3069,8 +3080,8 @@
         <w:t xml:space="preserve">parameter specifies the exact amount and Z-score 3-σ threshold produces roughly the same results), while consensus of agreeing ≥ 2 methods reduces this value to ~12%, resulting in less noisy and more accurate data than single-method output would have produced. The second implied baseline is a random overlap measure for FOMC: since each ticker has 2,514 trading days and 78 × 3 ≈ 234 of those days fall into ±2 days around each FOMC meeting date (due to the mid-week nature of these meetings), one can assume the baseline anomaly probability to be 234 / 2,514 ≈ 9.3%, whereas the actual FOMC-overlap percentage observed was 18.1%, which is roughly 2× this value, confirming the hypothesis that detector does detect anomalies, rather than random outliers.</w:t>
       </w:r>
     </w:p>
-    <w:bookmarkEnd w:id="18"/>
-    <w:bookmarkStart w:id="19" w:name="results-and-discussion"/>
+    <w:bookmarkEnd w:id="19"/>
+    <w:bookmarkStart w:id="20" w:name="results-and-discussion"/>
     <w:p>
       <w:pPr>
         <w:pStyle w:val="Heading2"/>
@@ -4141,8 +4152,8 @@
         <w:t xml:space="preserve">) gives valuable insights.</w:t>
       </w:r>
     </w:p>
-    <w:bookmarkEnd w:id="19"/>
-    <w:bookmarkStart w:id="23" w:name="limitations-and-future-work"/>
+    <w:bookmarkEnd w:id="20"/>
+    <w:bookmarkStart w:id="24" w:name="limitations-and-future-work"/>
     <w:p>
       <w:pPr>
         <w:pStyle w:val="Heading2"/>
@@ -4151,7 +4162,7 @@
         <w:t xml:space="preserve">8. Limitations and Future Work</w:t>
       </w:r>
     </w:p>
-    <w:bookmarkStart w:id="20" w:name="scope-changes-from-the-proposal"/>
+    <w:bookmarkStart w:id="21" w:name="scope-changes-from-the-proposal"/>
     <w:p>
       <w:pPr>
         <w:pStyle w:val="Heading3"/>
@@ -4256,8 +4267,8 @@
         <w:t xml:space="preserve">anomalies.</w:t>
       </w:r>
     </w:p>
-    <w:bookmarkEnd w:id="20"/>
-    <w:bookmarkStart w:id="21" w:name="inherent-limitations"/>
+    <w:bookmarkEnd w:id="21"/>
+    <w:bookmarkStart w:id="22" w:name="inherent-limitations"/>
     <w:p>
       <w:pPr>
         <w:pStyle w:val="Heading3"/>
@@ -4357,8 +4368,8 @@
         <w:t xml:space="preserve">hyperparameter is set to the same value for Isolation Forest and LOF, and is the only parameter in the two models, determining directly the number of anomalies; using a different value leads to a completely different precision-by-explanation score, and fine-grain tuning was not conducted. Finally, the ±2-day FOMC event and ±1-day sentiment event windows are heuristically selected according to common practice in the literature on event studies; they were never calibrated on a separate validation set, which is impossible since there is none in an unsupervised setting. The precision-by-explanation score, itself a proxy for performance, is high if most anomalies align with a plausible explanation; a small labeled anomaly dataset, e.g., the COVID crisis days in March 2020, can be used to cross-check the actual anomaly detection quality. Finally, the per-ticker z-score for the spike-in sentiment rule is computed on a static full history; this approach is biased theoretically because the z-score for a 2018 anomaly includes 2020 information; however, a non-biased solution involves a walking forward approach, which requires additional implementation effort.</w:t>
       </w:r>
     </w:p>
-    <w:bookmarkEnd w:id="21"/>
-    <w:bookmarkStart w:id="22" w:name="future-work"/>
+    <w:bookmarkEnd w:id="22"/>
+    <w:bookmarkStart w:id="23" w:name="future-work"/>
     <w:p>
       <w:pPr>
         <w:pStyle w:val="Heading3"/>
@@ -4574,9 +4585,9 @@
         <w:t xml:space="preserve">such as PostgreSQL with incremental ingestion if the pipeline grows beyond the current project scope.</w:t>
       </w:r>
     </w:p>
-    <w:bookmarkEnd w:id="22"/>
     <w:bookmarkEnd w:id="23"/>
-    <w:bookmarkStart w:id="24" w:name="references"/>
+    <w:bookmarkEnd w:id="24"/>
+    <w:bookmarkStart w:id="25" w:name="references"/>
     <w:p>
       <w:pPr>
         <w:pStyle w:val="Heading2"/>
@@ -4740,8 +4751,8 @@
         <w:t xml:space="preserve">GDELT Project. (2015). The GDELT Global Knowledge Graph (GKG) 2.0 codebook. https://blog.gdeltproject.org/gdelt-2-0-our-global-world-in-realtime/</w:t>
       </w:r>
     </w:p>
-    <w:bookmarkEnd w:id="24"/>
     <w:bookmarkEnd w:id="25"/>
+    <w:bookmarkEnd w:id="26"/>
     <w:sectPr>
       <w:footnotePr>
         <w:numRestart w:val="eachSect"/>

</xml_diff>